<commit_message>
docs: standardize on Supabase Postgres with Supavisor pooler
Update ADR-003 and the architecture docs to adopt Supabase-managed
Postgres connected via its built-in Supavisor pooler in transaction mode,
replacing the generic "managed Postgres + self-run pooler" approach. This
removes a moving part (no separately operated PgBouncer), while keeping
the data layer portable since it remains standard Postgres.

- ADR-003: rewrite decision/options/consequences around Supabase vs
  Cloud SQL; note transaction-pooling constraints (no session state,
  no long-lived prepared statements / LISTEN)
- ADR-007/ADR-008: note Supabase Auth as a future option and Supabase
  secrets/network hardening
- pool.ts: document transaction-mode pooler (port 6543) requirement
- .env.example: point DATABASE_URL at the Supabase transaction pooler
- README: reflect Supabase pooler in setup notes
</commit_message>
<xml_diff>
--- a/docs/architecture.docx
+++ b/docs/architecture.docx
@@ -1345,9 +1345,19 @@
         <w:t xml:space="preserve">PostgreSQL as the single system of record</w:t>
       </w:r>
       <w:r>
-        <w:t xml:space="preserve"> — managed, with a connection pooler in
-front to survive Cloud Run's serverless connection fan-out. ACID transactions are the
-backbone of transactional integrity. </w:t>
+        <w:t xml:space="preserve"> — managed on </w:t>
+      </w:r>
+      <w:r>
+        <w:rPr>
+          <w:b/>
+          <w:bCs/>
+        </w:rPr>
+        <w:t xml:space="preserve">Supabase</w:t>
+      </w:r>
+      <w:r>
+        <w:t xml:space="preserve">, whose built-in
+Supavisor pooler absorbs Cloud Run's serverless connection fan-out with nothing extra to
+run. ACID transactions are the backbone of transactional integrity. </w:t>
       </w:r>
       <w:r>
         <w:rPr>
@@ -1549,7 +1559,7 @@
       <w:r>
         <w:drawing>
           <wp:inline distT="0" distB="0" distL="0" distR="0">
-            <wp:extent cx="5715000" cy="3533775"/>
+            <wp:extent cx="5715000" cy="3638550"/>
             <wp:effectExtent t="0" r="0" b="0" l="0"/>
             <wp:docPr id="1" name="diagram-2" descr="Architecture diagram" title="Diagram"/>
             <wp:cNvGraphicFramePr>
@@ -1574,7 +1584,7 @@
                   <pic:spPr bwMode="auto">
                     <a:xfrm>
                       <a:off x="0" y="0"/>
-                      <a:ext cx="5715000" cy="3533775"/>
+                      <a:ext cx="5715000" cy="3638550"/>
                     </a:xfrm>
                     <a:prstGeom prst="rect">
                       <a:avLst/>
@@ -1921,31 +1931,44 @@
           <w:b/>
           <w:bCs/>
         </w:rPr>
-        <w:t xml:space="preserve">Connection Pooler</w:t>
-      </w:r>
-      <w:r>
-        <w:t xml:space="preserve"> — multiplexes Cloud Run's many short-lived connections down to a
-bounded set the database can handle (see ADR-003).</w:t>
-      </w:r>
-    </w:p>
-    <w:p>
-      <w:pPr>
-        <w:pStyle w:val="ListParagraph"/>
-        <w:numPr>
-          <w:ilvl w:val="0"/>
-          <w:numId w:val="2"/>
-        </w:numPr>
-        <w:spacing w:after="60"/>
-      </w:pPr>
-      <w:r>
-        <w:rPr>
-          <w:b/>
-          <w:bCs/>
-        </w:rPr>
-        <w:t xml:space="preserve">PostgreSQL</w:t>
-      </w:r>
-      <w:r>
-        <w:t xml:space="preserve"> — the single system of record for every entity.</w:t>
+        <w:t xml:space="preserve">Supavisor Pooler (Supabase, built-in)</w:t>
+      </w:r>
+      <w:r>
+        <w:t xml:space="preserve"> — multiplexes Cloud Run's many short-lived
+connections down to a bounded set the database can handle. Bundled with Supabase, so it is
+configuration, not infrastructure to operate (see ADR-003). The API connects through its
+</w:t>
+      </w:r>
+      <w:r>
+        <w:rPr>
+          <w:b/>
+          <w:bCs/>
+        </w:rPr>
+        <w:t xml:space="preserve">transaction-mode</w:t>
+      </w:r>
+      <w:r>
+        <w:t xml:space="preserve"> pooler endpoint.</w:t>
+      </w:r>
+    </w:p>
+    <w:p>
+      <w:pPr>
+        <w:pStyle w:val="ListParagraph"/>
+        <w:numPr>
+          <w:ilvl w:val="0"/>
+          <w:numId w:val="2"/>
+        </w:numPr>
+        <w:spacing w:after="60"/>
+      </w:pPr>
+      <w:r>
+        <w:rPr>
+          <w:b/>
+          <w:bCs/>
+        </w:rPr>
+        <w:t xml:space="preserve">PostgreSQL (Supabase)</w:t>
+      </w:r>
+      <w:r>
+        <w:t xml:space="preserve"> — the single system of record for every entity. Standard
+Postgres, so nothing about the data layer is Supabase-proprietary.</w:t>
       </w:r>
     </w:p>
     <w:p>
@@ -2363,7 +2386,8 @@
         <w:t xml:space="preserve">Secrets:</w:t>
       </w:r>
       <w:r>
-        <w:t xml:space="preserve"> Stripe keys, DB credentials, email keys in </w:t>
+        <w:t xml:space="preserve"> Stripe keys, the Supabase database URL + service credentials, and email keys
+in </w:t>
       </w:r>
       <w:r>
         <w:rPr>
@@ -2373,8 +2397,7 @@
         <w:t xml:space="preserve">Secret Manager</w:t>
       </w:r>
       <w:r>
-        <w:t xml:space="preserve">, injected as
-env vars — never in source or in the frontends.</w:t>
+        <w:t xml:space="preserve">, injected as env vars — never in source or in the frontends.</w:t>
       </w:r>
     </w:p>
     <w:p>
@@ -2394,8 +2417,9 @@
         <w:t xml:space="preserve">Networking:</w:t>
       </w:r>
       <w:r>
-        <w:t xml:space="preserve"> all traffic HTTPS. The database is reachable only by the API (private
-connectivity / authorized networks), never by the frontends or the public internet.</w:t>
+        <w:t xml:space="preserve"> all traffic HTTPS. Only the API holds the Supabase credentials; the
+frontends never talk to the database directly. Tighten further with Supabase network
+restrictions / SSL-enforced connections.</w:t>
       </w:r>
     </w:p>
     <w:p>
@@ -2539,11 +2563,12 @@
           <w:b/>
           <w:bCs/>
         </w:rPr>
-        <w:t xml:space="preserve">PostgreSQL</w:t>
-      </w:r>
-      <w:r>
-        <w:t xml:space="preserve"> is the single system of record (ADR-003). Relational, transactional, with
-JSONB available for the occasional semi-structured field — no second store needed.</w:t>
+        <w:t xml:space="preserve">PostgreSQL on Supabase</w:t>
+      </w:r>
+      <w:r>
+        <w:t xml:space="preserve"> is the single system of record (ADR-003). Relational,
+transactional, with JSONB available for the occasional semi-structured field — no second
+store needed.</w:t>
       </w:r>
     </w:p>
     <w:p>
@@ -2608,19 +2633,30 @@
         <w:t xml:space="preserve">Backups:</w:t>
       </w:r>
       <w:r>
-        <w:t xml:space="preserve"> managed Postgres point-in-time recovery. Target </w:t>
-      </w:r>
-      <w:r>
-        <w:rPr>
-          <w:b/>
-          <w:bCs/>
-        </w:rPr>
-        <w:t xml:space="preserve">RPO ≤ 5 min, RTO ≤ 1
-hour</w:t>
-      </w:r>
-      <w:r>
-        <w:t xml:space="preserve"> — generous for a single shop and met by the managed provider's defaults. Verify
-restores periodically; an untested backup is not a backup.</w:t>
+        <w:t xml:space="preserve"> Supabase </w:t>
+      </w:r>
+      <w:r>
+        <w:rPr>
+          <w:b/>
+          <w:bCs/>
+        </w:rPr>
+        <w:t xml:space="preserve">point-in-time recovery (PITR)</w:t>
+      </w:r>
+      <w:r>
+        <w:t xml:space="preserve"> plus daily backups. Target
+</w:t>
+      </w:r>
+      <w:r>
+        <w:rPr>
+          <w:b/>
+          <w:bCs/>
+        </w:rPr>
+        <w:t xml:space="preserve">RPO ≤ 5 min, RTO ≤ 1 hour</w:t>
+      </w:r>
+      <w:r>
+        <w:t xml:space="preserve"> — generous for a single shop and met by Supabase's defaults
+(confirm PITR is enabled on the chosen plan). Verify restores periodically; an untested
+backup is not a backup.</w:t>
       </w:r>
     </w:p>
     <w:p>
@@ -3207,7 +3243,7 @@
         <w:pStyle w:val="Heading2"/>
       </w:pPr>
       <w:r>
-        <w:t xml:space="preserve">ADR-003: PostgreSQL as the single system of record, with a connection pooler</w:t>
+        <w:t xml:space="preserve">ADR-003: Supabase-managed PostgreSQL as the single system of record</w:t>
       </w:r>
     </w:p>
     <w:p>
@@ -3251,7 +3287,8 @@
 The data is highly relational (products, stock, customers, orders, line items, invoices,
 payments) and the system must guarantee transactional integrity over money and stock. The
 API runs on Cloud Run, which can spawn many concurrent instances, each opening database
-connections — and Postgres has a low connection ceiling.</w:t>
+connections — and Postgres has a low connection ceiling, so a pooler is mandatory, not
+optional.</w:t>
       </w:r>
     </w:p>
     <w:p>
@@ -3274,22 +3311,22 @@
           <w:b/>
           <w:bCs/>
         </w:rPr>
-        <w:t xml:space="preserve">single managed PostgreSQL</w:t>
-      </w:r>
-      <w:r>
-        <w:t xml:space="preserve"> database as the system of record, fronted by a
-</w:t>
-      </w:r>
-      <w:r>
-        <w:rPr>
-          <w:b/>
-          <w:bCs/>
-        </w:rPr>
-        <w:t xml:space="preserve">connection pooler</w:t>
-      </w:r>
-      <w:r>
-        <w:t xml:space="preserve"> (PgBouncer-style). A provider with a built-in pooler (e.g. Neon or
-Supabase) is preferred to minimize ops; Cloud SQL + a pooler is the alternative.</w:t>
+        <w:t xml:space="preserve">single managed PostgreSQL database on Supabase</w:t>
+      </w:r>
+      <w:r>
+        <w:t xml:space="preserve"> as the system of record,
+connecting through Supabase's </w:t>
+      </w:r>
+      <w:r>
+        <w:rPr>
+          <w:b/>
+          <w:bCs/>
+        </w:rPr>
+        <w:t xml:space="preserve">built-in Supavisor pooler in transaction mode</w:t>
+      </w:r>
+      <w:r>
+        <w:t xml:space="preserve">. There is no
+separately operated pooler.</w:t>
       </w:r>
     </w:p>
     <w:p>
@@ -3318,12 +3355,46 @@
           <w:b/>
           <w:bCs/>
         </w:rPr>
-        <w:t xml:space="preserve">Managed Postgres + pooler (chosen)</w:t>
-      </w:r>
-      <w:r>
-        <w:t xml:space="preserve"> — ACID transactions, joins, mature ecosystem, and
-the pooler solves the serverless connection-fan-out problem. Con: one more piece (the
-pooler) — eliminated if the provider bundles it.</w:t>
+        <w:t xml:space="preserve">Supabase (chosen)</w:t>
+      </w:r>
+      <w:r>
+        <w:t xml:space="preserve"> — managed Postgres with a </w:t>
+      </w:r>
+      <w:r>
+        <w:rPr>
+          <w:b/>
+          <w:bCs/>
+        </w:rPr>
+        <w:t xml:space="preserve">bundled connection pooler</w:t>
+      </w:r>
+      <w:r>
+        <w:t xml:space="preserve">, PITR
+backups, and a free/low-cost tier that fits a single shop; removes the one extra moving
+part (a self-run PgBouncer). It is standard Postgres, so the data layer stays portable.
+Con: GCP and the database then live with different vendors (acceptable; latency between
+Cloud Run and a nearby Supabase region is small — co-locate regions).</w:t>
+      </w:r>
+    </w:p>
+    <w:p>
+      <w:pPr>
+        <w:pStyle w:val="ListParagraph"/>
+        <w:numPr>
+          <w:ilvl w:val="0"/>
+          <w:numId w:val="2"/>
+        </w:numPr>
+        <w:spacing w:after="60"/>
+      </w:pPr>
+      <w:r>
+        <w:rPr>
+          <w:b/>
+          <w:bCs/>
+        </w:rPr>
+        <w:t xml:space="preserve">Cloud SQL for Postgres + a pooler</w:t>
+      </w:r>
+      <w:r>
+        <w:t xml:space="preserve"> — GCP-native and same-cloud as the API, but the pooler
+is something to stand up and operate, and there is no free tier. Lost on solo-simplicity and
+cost; the bundled-pooler convenience of Supabase won.</w:t>
       </w:r>
     </w:p>
     <w:p>
@@ -3343,8 +3414,8 @@
         <w:t xml:space="preserve">NoSQL/document store</w:t>
       </w:r>
       <w:r>
-        <w:t xml:space="preserve"> — easy horizontal scale, but no multi-document ACID transactions
-in the shape we need, and our data is relational. Rejected: fights goal 1.</w:t>
+        <w:t xml:space="preserve"> — easy horizontal scale, but no multi-document ACID transactions in
+the shape we need, and our data is relational. Rejected: fights goal 1.</w:t>
       </w:r>
     </w:p>
     <w:p>
@@ -3381,10 +3452,47 @@
       </w:r>
       <w:r>
         <w:t xml:space="preserve">
-Strong consistency for the operations that matter, with a familiar query model. We accept
-running (or paying a provider for) a pooler, and we must treat the connection limit as a real
-budget. A single primary is a scaling ceiling far above this shop's needs; read replicas can
-be added later without app changes.</w:t>
+Strong consistency for the operations that matter, a familiar query model, and zero pooler
+ops. We accept a two-vendor setup (Cloud Run on GCP, database on Supabase) — mitigated by
+choosing nearby regions — and must use the </w:t>
+      </w:r>
+      <w:r>
+        <w:rPr>
+          <w:b/>
+          <w:bCs/>
+        </w:rPr>
+        <w:t xml:space="preserve">transaction-mode pooler endpoint</w:t>
+      </w:r>
+      <w:r>
+        <w:t xml:space="preserve"> from Cloud
+Run (so code avoids session-level features incompatible with transaction pooling, e.g.
+long-lived prepared statements / </w:t>
+      </w:r>
+      <w:r>
+        <w:rPr>
+          <w:rFonts w:ascii="Consolas" w:cs="Consolas" w:eastAsia="Consolas" w:hAnsi="Consolas"/>
+          <w:sz w:val="20"/>
+          <w:szCs w:val="20"/>
+          <w:shd w:fill="F0F0F0" w:val="clear"/>
+        </w:rPr>
+        <w:t xml:space="preserve">LISTEN</w:t>
+      </w:r>
+      <w:r>
+        <w:t xml:space="preserve">). Because it is standard Postgres, migrating to
+Cloud SQL later is a </w:t>
+      </w:r>
+      <w:r>
+        <w:rPr>
+          <w:rFonts w:ascii="Consolas" w:cs="Consolas" w:eastAsia="Consolas" w:hAnsi="Consolas"/>
+          <w:sz w:val="20"/>
+          <w:szCs w:val="20"/>
+          <w:shd w:fill="F0F0F0" w:val="clear"/>
+        </w:rPr>
+        <w:t xml:space="preserve">pg_dump</w:t>
+      </w:r>
+      <w:r>
+        <w:t xml:space="preserve">/restore, not a rewrite. A single primary is a scaling ceiling
+far above this shop's needs; Supabase read replicas can be added later without app changes.</w:t>
       </w:r>
     </w:p>
     <w:p>
@@ -4154,11 +4262,23 @@
           <w:b/>
           <w:bCs/>
         </w:rPr>
-        <w:t xml:space="preserve">Managed external auth (Clerk/Auth0)</w:t>
-      </w:r>
-      <w:r>
-        <w:t xml:space="preserve"> — offloads auth entirely, but adds cost and a
-dependency for needs a library covers fine at this scale. Reasonable future option, not now.</w:t>
+        <w:t xml:space="preserve">Managed external auth (Supabase Auth / Clerk/Auth0)</w:t>
+      </w:r>
+      <w:r>
+        <w:t xml:space="preserve"> — offloads auth entirely. Since the
+database already lives on Supabase, </w:t>
+      </w:r>
+      <w:r>
+        <w:rPr>
+          <w:b/>
+          <w:bCs/>
+        </w:rPr>
+        <w:t xml:space="preserve">Supabase Auth</w:t>
+      </w:r>
+      <w:r>
+        <w:t xml:space="preserve"> is the lowest-friction managed option
+(especially for the customer realm) and a natural future escape hatch. Adds a dependency for
+needs a library covers fine at this scale, so not adopted now — but the closest upgrade path.</w:t>
       </w:r>
     </w:p>
     <w:p>
@@ -4364,10 +4484,10 @@
       </w:r>
       <w:r>
         <w:t xml:space="preserve">
-We move fast and run almost nothing ourselves. Postgres and the domain logic are the portable
-heart; the managed conveniences around them (Cloud Run, Cloud Tasks, Vercel) are replaceable
-with contained effort. We accept GCP/Vercel/Stripe coupling at the edges as a conscious,
-bounded cost.</w:t>
+We move fast and run almost nothing ourselves. Postgres (on Supabase, but standard Postgres)
+and the domain logic are the portable heart; the managed conveniences around them (Cloud Run,
+Cloud Tasks, Vercel, Supabase) are replaceable with contained effort. We accept
+GCP/Vercel/Stripe/Supabase coupling at the edges as a conscious, bounded cost.</w:t>
       </w:r>
     </w:p>
     <w:p>
@@ -5007,9 +5127,11 @@
         <w:t xml:space="preserve">Single database, single region.</w:t>
       </w:r>
       <w:r>
-        <w:t xml:space="preserve"> A regional outage or a corrupting bug takes the system
-down until recovery. Acceptable for one shop given the RTO target; mitigated by managed
-backups and PITR. Read replicas / multi-region are future options, not launch needs.</w:t>
+        <w:t xml:space="preserve"> An outage of the Supabase region or a corrupting bug
+takes the system down until recovery. Acceptable for one shop given the RTO target;
+mitigated by Supabase PITR and daily backups. Read replicas / multi-region are future
+options, not launch needs. (Co-locate the Supabase region with the Cloud Run region to keep
+query latency low.)</w:t>
       </w:r>
     </w:p>
     <w:p>

</xml_diff>